<commit_message>
Last attempt for a responsive website
</commit_message>
<xml_diff>
--- a/Assessment 2 - Web Programming.docx
+++ b/Assessment 2 - Web Programming.docx
@@ -909,32 +909,6 @@
         <w:spacing w:lineRule="auto" w:line="360" w:before="0" w:after="151"/>
         <w:ind w:right="816"/>
         <w:jc w:val="both"/>
-        <w:rPr>
-          <w:rFonts w:ascii="Arial" w:hAnsi="Arial" w:eastAsia="Walbaum Heading" w:cs="Walbaum Heading"/>
-          <w:b w:val="false"/>
-          <w:bCs w:val="false"/>
-          <w:color w:val="3465A4"/>
-          <w:sz w:val="52"/>
-          <w:szCs w:val="52"/>
-        </w:rPr>
-      </w:pPr>
-      <w:r>
-        <w:rPr>
-          <w:rFonts w:eastAsia="Walbaum Heading" w:cs="Walbaum Heading" w:ascii="Arial" w:hAnsi="Arial"/>
-          <w:b w:val="false"/>
-          <w:bCs w:val="false"/>
-          <w:color w:val="3465A4"/>
-          <w:sz w:val="52"/>
-          <w:szCs w:val="52"/>
-        </w:rPr>
-      </w:r>
-    </w:p>
-    <w:p>
-      <w:pPr>
-        <w:pStyle w:val="Normal"/>
-        <w:spacing w:lineRule="auto" w:line="360" w:before="0" w:after="151"/>
-        <w:ind w:right="816"/>
-        <w:jc w:val="both"/>
         <w:rPr/>
       </w:pPr>
       <w:r>
@@ -1284,70 +1258,129 @@
         <w:jc w:val="both"/>
         <w:rPr>
           <w:rFonts w:ascii="Arial" w:hAnsi="Arial" w:cs="Times New Roman"/>
+          <w:b w:val="false"/>
+          <w:bCs w:val="false"/>
+          <w:sz w:val="28"/>
+          <w:szCs w:val="28"/>
+        </w:rPr>
+      </w:pPr>
+      <w:r>
+        <w:rPr>
+          <w:rFonts w:cs="Times New Roman" w:ascii="Arial" w:hAnsi="Arial"/>
           <w:b/>
           <w:bCs/>
           <w:sz w:val="28"/>
           <w:szCs w:val="28"/>
         </w:rPr>
-      </w:pPr>
-      <w:r>
-        <w:rPr>
-          <w:rFonts w:cs="Times New Roman" w:ascii="Arial" w:hAnsi="Arial"/>
+        <w:t>Shields.io Badges</w:t>
+      </w:r>
+      <w:r>
+        <w:rPr>
+          <w:rFonts w:cs="Times New Roman" w:ascii="Arial" w:hAnsi="Arial"/>
+          <w:b w:val="false"/>
+          <w:bCs w:val="false"/>
+          <w:sz w:val="28"/>
+          <w:szCs w:val="28"/>
+        </w:rPr>
+        <w:t xml:space="preserve"> — Commonly used in Github portfolios in README.md files to showcase milestones.</w:t>
+      </w:r>
+    </w:p>
+    <w:p>
+      <w:pPr>
+        <w:pStyle w:val="Normal"/>
+        <w:spacing w:lineRule="auto" w:line="360" w:before="0" w:after="155"/>
+        <w:ind w:left="90" w:right="816"/>
+        <w:jc w:val="both"/>
+        <w:rPr>
+          <w:rFonts w:ascii="Arial" w:hAnsi="Arial" w:cs="Times New Roman"/>
+          <w:b w:val="false"/>
+          <w:bCs w:val="false"/>
+          <w:sz w:val="28"/>
+          <w:szCs w:val="28"/>
+        </w:rPr>
+      </w:pPr>
+      <w:r>
+        <w:rPr>
+          <w:rFonts w:cs="Times New Roman" w:ascii="Arial" w:hAnsi="Arial"/>
+          <w:b w:val="false"/>
+          <w:bCs w:val="false"/>
+          <w:sz w:val="28"/>
+          <w:szCs w:val="28"/>
+        </w:rPr>
+      </w:r>
+    </w:p>
+    <w:p>
+      <w:pPr>
+        <w:pStyle w:val="Normal"/>
+        <w:spacing w:lineRule="auto" w:line="360" w:before="0" w:after="155"/>
+        <w:ind w:left="90" w:right="816"/>
+        <w:jc w:val="both"/>
+        <w:rPr>
+          <w:rFonts w:ascii="Arial" w:hAnsi="Arial" w:cs="Times New Roman"/>
           <w:b/>
           <w:bCs/>
           <w:sz w:val="28"/>
           <w:szCs w:val="28"/>
         </w:rPr>
-        <w:t>Glass Effect</w:t>
-      </w:r>
-      <w:r>
-        <w:rPr>
-          <w:rFonts w:cs="Times New Roman" w:ascii="Arial" w:hAnsi="Arial"/>
-          <w:b w:val="false"/>
-          <w:bCs w:val="false"/>
-          <w:sz w:val="28"/>
-          <w:szCs w:val="28"/>
-        </w:rPr>
-        <w:t xml:space="preserve"> — Used in the navigation bar, content windows, and footer for a modernized look.</w:t>
-      </w:r>
-    </w:p>
-    <w:p>
-      <w:pPr>
-        <w:pStyle w:val="Normal"/>
-        <w:spacing w:lineRule="auto" w:line="360" w:before="0" w:after="155"/>
-        <w:ind w:left="90" w:right="816"/>
-        <w:jc w:val="both"/>
-        <w:rPr>
-          <w:rFonts w:ascii="Arial" w:hAnsi="Arial" w:cs="Times New Roman"/>
+      </w:pPr>
+      <w:r>
+        <w:rPr>
+          <w:rFonts w:cs="Times New Roman" w:ascii="Arial" w:hAnsi="Arial"/>
           <w:b/>
           <w:bCs/>
           <w:sz w:val="28"/>
           <w:szCs w:val="28"/>
         </w:rPr>
-      </w:pPr>
-      <w:r>
-        <w:rPr>
-          <w:rFonts w:cs="Times New Roman" w:ascii="Arial" w:hAnsi="Arial"/>
+        <w:t>YouTube Embeds</w:t>
+      </w:r>
+      <w:r>
+        <w:rPr>
+          <w:rFonts w:cs="Times New Roman" w:ascii="Arial" w:hAnsi="Arial"/>
+          <w:b w:val="false"/>
+          <w:bCs w:val="false"/>
+          <w:sz w:val="28"/>
+          <w:szCs w:val="28"/>
+        </w:rPr>
+        <w:t xml:space="preserve"> — Showcases some of the projects that are already available in YouTube using iframes.</w:t>
+      </w:r>
+    </w:p>
+    <w:p>
+      <w:pPr>
+        <w:pStyle w:val="Normal"/>
+        <w:spacing w:lineRule="auto" w:line="360" w:before="0" w:after="155"/>
+        <w:ind w:left="90" w:right="816"/>
+        <w:jc w:val="both"/>
+        <w:rPr>
+          <w:rFonts w:ascii="Arial" w:hAnsi="Arial" w:cs="Times New Roman"/>
+          <w:b w:val="false"/>
+          <w:bCs w:val="false"/>
+          <w:sz w:val="28"/>
+          <w:szCs w:val="28"/>
+        </w:rPr>
+      </w:pPr>
+      <w:r>
+        <w:rPr>
+          <w:rFonts w:cs="Times New Roman" w:ascii="Arial" w:hAnsi="Arial"/>
+          <w:b w:val="false"/>
+          <w:bCs w:val="false"/>
+          <w:sz w:val="28"/>
+          <w:szCs w:val="28"/>
+        </w:rPr>
+      </w:r>
+    </w:p>
+    <w:p>
+      <w:pPr>
+        <w:pStyle w:val="Normal"/>
+        <w:spacing w:lineRule="auto" w:line="360" w:before="0" w:after="155"/>
+        <w:ind w:left="90" w:right="816"/>
+        <w:jc w:val="both"/>
+        <w:rPr>
+          <w:rFonts w:ascii="Arial" w:hAnsi="Arial" w:cs="Times New Roman"/>
           <w:b/>
           <w:bCs/>
           <w:sz w:val="28"/>
           <w:szCs w:val="28"/>
         </w:rPr>
-      </w:r>
-    </w:p>
-    <w:p>
-      <w:pPr>
-        <w:pStyle w:val="Normal"/>
-        <w:spacing w:lineRule="auto" w:line="360" w:before="0" w:after="155"/>
-        <w:ind w:left="90" w:right="816"/>
-        <w:jc w:val="both"/>
-        <w:rPr>
-          <w:rFonts w:ascii="Arial" w:hAnsi="Arial" w:cs="Times New Roman"/>
-          <w:b w:val="false"/>
-          <w:bCs w:val="false"/>
-          <w:sz w:val="28"/>
-          <w:szCs w:val="28"/>
-        </w:rPr>
       </w:pPr>
       <w:r>
         <w:rPr>
@@ -1357,17 +1390,17 @@
           <w:sz w:val="28"/>
           <w:szCs w:val="28"/>
         </w:rPr>
-        <w:t>Sheilds.io Badges</w:t>
-      </w:r>
-      <w:r>
-        <w:rPr>
-          <w:rFonts w:cs="Times New Roman" w:ascii="Arial" w:hAnsi="Arial"/>
-          <w:b w:val="false"/>
-          <w:bCs w:val="false"/>
-          <w:sz w:val="28"/>
-          <w:szCs w:val="28"/>
-        </w:rPr>
-        <w:t xml:space="preserve"> — Commonly used in Github portfolios in README.md files to showcase achievements.</w:t>
+        <w:t>p5.js Embed</w:t>
+      </w:r>
+      <w:r>
+        <w:rPr>
+          <w:rFonts w:cs="Times New Roman" w:ascii="Arial" w:hAnsi="Arial"/>
+          <w:b w:val="false"/>
+          <w:bCs w:val="false"/>
+          <w:sz w:val="28"/>
+          <w:szCs w:val="28"/>
+        </w:rPr>
+        <w:t xml:space="preserve"> — The animated background is an iframe element used to feature my skills in creative coding which is enhanced throughout the semester. The animated background is powered by p5.js, a graphics library for JavaScript useful for expressing creativity through code.</w:t>
       </w:r>
     </w:p>
     <w:p>
@@ -1417,7 +1450,7 @@
           <w:szCs w:val="28"/>
         </w:rPr>
         <w:tab/>
-        <w:t>The animated background is an iframe element used to feature my skills in creative coding which is enhanced throughout the semester. The animated background is powered by p5.js, a graphics library for JavaScript useful for expressing creativity through code.</w:t>
+        <w:t>The website utilizes semantic elements for proper structuring and for search engines to understand the contents of the web page better. This is called Search Engine Optimization (SEO) and it improves the search ranking of the website when a user tries to find it. The following are the semantic elements utilized:</w:t>
       </w:r>
     </w:p>
     <w:p>
@@ -1427,168 +1460,36 @@
         <w:ind w:left="90" w:right="816"/>
         <w:jc w:val="both"/>
         <w:rPr>
-          <w:rFonts w:ascii="Arial" w:hAnsi="Arial" w:eastAsia="Walbaum Heading" w:cs="Walbaum Heading"/>
-          <w:b w:val="false"/>
-          <w:bCs w:val="false"/>
-          <w:color w:val="1B60C1"/>
-          <w:sz w:val="52"/>
-          <w:szCs w:val="52"/>
-        </w:rPr>
-      </w:pPr>
-      <w:r>
-        <w:rPr>
-          <w:rFonts w:eastAsia="Walbaum Heading" w:cs="Walbaum Heading" w:ascii="Arial" w:hAnsi="Arial"/>
-          <w:b w:val="false"/>
-          <w:bCs w:val="false"/>
-          <w:color w:val="1B60C1"/>
-          <w:sz w:val="52"/>
-          <w:szCs w:val="52"/>
-        </w:rPr>
-      </w:r>
-    </w:p>
-    <w:p>
-      <w:pPr>
-        <w:pStyle w:val="Normal"/>
-        <w:spacing w:lineRule="auto" w:line="360" w:before="0" w:after="0"/>
-        <w:jc w:val="both"/>
-        <w:rPr>
-          <w:color w:val="3465A4"/>
-        </w:rPr>
-      </w:pPr>
-      <w:r>
-        <w:rPr>
-          <w:rFonts w:eastAsia="Walbaum Heading" w:cs="Walbaum Heading" w:ascii="Arial" w:hAnsi="Arial"/>
-          <w:b w:val="false"/>
-          <w:bCs w:val="false"/>
-          <w:color w:val="3465A4"/>
-          <w:sz w:val="52"/>
-          <w:szCs w:val="52"/>
-        </w:rPr>
-        <w:t>Interaction Overview</w:t>
-      </w:r>
-    </w:p>
-    <w:p>
-      <w:pPr>
-        <w:pStyle w:val="Normal"/>
-        <w:spacing w:lineRule="auto" w:line="360" w:before="0" w:after="32"/>
-        <w:ind w:left="90" w:right="816"/>
-        <w:jc w:val="both"/>
-        <w:rPr>
-          <w:rFonts w:ascii="Arial" w:hAnsi="Arial" w:cs="Times New Roman"/>
-          <w:b w:val="false"/>
-          <w:bCs w:val="false"/>
-          <w:sz w:val="28"/>
-          <w:szCs w:val="28"/>
-        </w:rPr>
-      </w:pPr>
-      <w:r>
-        <w:rPr>
-          <w:rFonts w:cs="Times New Roman" w:ascii="Arial" w:hAnsi="Arial"/>
-          <w:b w:val="false"/>
-          <w:bCs w:val="false"/>
-          <w:sz w:val="28"/>
-          <w:szCs w:val="28"/>
-        </w:rPr>
-        <w:tab/>
-        <w:t>The website features a navigation bar and a footer and 7 navigational links to various parts of the page: About Me, Projects, Professions, FlameRender Studios (the clickable logo), Community, Software, and Subscribe.</w:t>
-      </w:r>
-    </w:p>
-    <w:p>
-      <w:pPr>
-        <w:pStyle w:val="Normal"/>
-        <w:spacing w:lineRule="auto" w:line="360" w:before="0" w:after="32"/>
-        <w:ind w:left="90" w:right="816"/>
-        <w:jc w:val="both"/>
-        <w:rPr>
-          <w:rFonts w:ascii="Arial" w:hAnsi="Arial" w:cs="Times New Roman"/>
-          <w:b w:val="false"/>
-          <w:bCs w:val="false"/>
-          <w:sz w:val="28"/>
-          <w:szCs w:val="28"/>
-        </w:rPr>
-      </w:pPr>
-      <w:r>
-        <w:rPr>
-          <w:rFonts w:cs="Times New Roman" w:ascii="Arial" w:hAnsi="Arial"/>
-          <w:b w:val="false"/>
-          <w:bCs w:val="false"/>
-          <w:sz w:val="28"/>
-          <w:szCs w:val="28"/>
-        </w:rPr>
-      </w:r>
-    </w:p>
-    <w:p>
-      <w:pPr>
-        <w:pStyle w:val="Normal"/>
-        <w:spacing w:lineRule="auto" w:line="360" w:before="0" w:after="32"/>
-        <w:ind w:left="90" w:right="816"/>
-        <w:jc w:val="both"/>
-        <w:rPr>
-          <w:rFonts w:ascii="Arial" w:hAnsi="Arial" w:cs="Times New Roman"/>
-          <w:b w:val="false"/>
-          <w:bCs w:val="false"/>
-          <w:sz w:val="28"/>
-          <w:szCs w:val="28"/>
-        </w:rPr>
-      </w:pPr>
-      <w:r>
-        <w:rPr>
-          <w:rFonts w:cs="Times New Roman" w:ascii="Arial" w:hAnsi="Arial"/>
+          <w:rFonts w:ascii="Arial" w:hAnsi="Arial" w:cs="Times New Roman"/>
+          <w:b w:val="false"/>
+          <w:bCs w:val="false"/>
+          <w:sz w:val="28"/>
+          <w:szCs w:val="28"/>
+        </w:rPr>
+      </w:pPr>
+      <w:r>
+        <w:rPr>
+          <w:rFonts w:cs="Times New Roman" w:ascii="Arial" w:hAnsi="Arial"/>
+          <w:b w:val="false"/>
+          <w:bCs w:val="false"/>
+          <w:sz w:val="28"/>
+          <w:szCs w:val="28"/>
+        </w:rPr>
+      </w:r>
+    </w:p>
+    <w:p>
+      <w:pPr>
+        <w:pStyle w:val="Normal"/>
+        <w:spacing w:lineRule="auto" w:line="360" w:before="0" w:after="155"/>
+        <w:ind w:left="90" w:right="816"/>
+        <w:jc w:val="both"/>
+        <w:rPr>
+          <w:rFonts w:ascii="Arial" w:hAnsi="Arial" w:cs="Times New Roman"/>
           <w:b/>
           <w:bCs/>
           <w:sz w:val="28"/>
           <w:szCs w:val="28"/>
         </w:rPr>
-        <w:t xml:space="preserve">Navigation Bar </w:t>
-      </w:r>
-      <w:r>
-        <w:rPr>
-          <w:rFonts w:cs="Times New Roman" w:ascii="Arial" w:hAnsi="Arial"/>
-          <w:b w:val="false"/>
-          <w:bCs w:val="false"/>
-          <w:sz w:val="28"/>
-          <w:szCs w:val="28"/>
-        </w:rPr>
-        <w:t>— Features the 7 navigational links including the clickable website logo. It also features button animation hovers.</w:t>
-      </w:r>
-    </w:p>
-    <w:p>
-      <w:pPr>
-        <w:pStyle w:val="Normal"/>
-        <w:spacing w:lineRule="auto" w:line="360" w:before="0" w:after="32"/>
-        <w:ind w:left="90" w:right="816"/>
-        <w:jc w:val="both"/>
-        <w:rPr>
-          <w:rFonts w:ascii="Arial" w:hAnsi="Arial" w:cs="Times New Roman"/>
-          <w:b w:val="false"/>
-          <w:bCs w:val="false"/>
-          <w:sz w:val="28"/>
-          <w:szCs w:val="28"/>
-        </w:rPr>
-      </w:pPr>
-      <w:r>
-        <w:rPr>
-          <w:rFonts w:cs="Times New Roman" w:ascii="Arial" w:hAnsi="Arial"/>
-          <w:b w:val="false"/>
-          <w:bCs w:val="false"/>
-          <w:sz w:val="28"/>
-          <w:szCs w:val="28"/>
-        </w:rPr>
-      </w:r>
-    </w:p>
-    <w:p>
-      <w:pPr>
-        <w:pStyle w:val="Normal"/>
-        <w:spacing w:lineRule="auto" w:line="360" w:before="0" w:after="32"/>
-        <w:ind w:left="90" w:right="816"/>
-        <w:jc w:val="both"/>
-        <w:rPr>
-          <w:rFonts w:ascii="Arial" w:hAnsi="Arial" w:cs="Times New Roman"/>
-          <w:b w:val="false"/>
-          <w:bCs w:val="false"/>
-          <w:sz w:val="28"/>
-          <w:szCs w:val="28"/>
-        </w:rPr>
       </w:pPr>
       <w:r>
         <w:rPr>
@@ -1598,233 +1499,174 @@
           <w:sz w:val="28"/>
           <w:szCs w:val="28"/>
         </w:rPr>
-        <w:t>About Me</w:t>
-      </w:r>
-      <w:r>
-        <w:rPr>
-          <w:rFonts w:cs="Times New Roman" w:ascii="Arial" w:hAnsi="Arial"/>
-          <w:b w:val="false"/>
-          <w:bCs w:val="false"/>
-          <w:sz w:val="28"/>
-          <w:szCs w:val="28"/>
-        </w:rPr>
-        <w:t xml:space="preserve"> — Features a short biography about me and my personal background.</w:t>
-      </w:r>
-    </w:p>
-    <w:p>
-      <w:pPr>
-        <w:pStyle w:val="Normal"/>
-        <w:spacing w:lineRule="auto" w:line="360" w:before="0" w:after="32"/>
-        <w:ind w:left="90" w:right="816"/>
-        <w:jc w:val="both"/>
-        <w:rPr>
-          <w:rFonts w:ascii="Arial" w:hAnsi="Arial" w:cs="Times New Roman"/>
-          <w:b w:val="false"/>
-          <w:bCs w:val="false"/>
-          <w:sz w:val="28"/>
-          <w:szCs w:val="28"/>
-        </w:rPr>
-      </w:pPr>
-      <w:r>
-        <w:rPr>
-          <w:rFonts w:cs="Times New Roman" w:ascii="Arial" w:hAnsi="Arial"/>
-          <w:b w:val="false"/>
-          <w:bCs w:val="false"/>
-          <w:sz w:val="28"/>
-          <w:szCs w:val="28"/>
-        </w:rPr>
-      </w:r>
-    </w:p>
-    <w:p>
-      <w:pPr>
-        <w:pStyle w:val="Normal"/>
-        <w:spacing w:lineRule="auto" w:line="360" w:before="0" w:after="32"/>
-        <w:ind w:left="90" w:right="816"/>
-        <w:jc w:val="both"/>
-        <w:rPr>
-          <w:rFonts w:ascii="Arial" w:hAnsi="Arial" w:cs="Times New Roman"/>
-          <w:b w:val="false"/>
-          <w:bCs w:val="false"/>
-          <w:sz w:val="28"/>
-          <w:szCs w:val="28"/>
-        </w:rPr>
-      </w:pPr>
-      <w:r>
-        <w:rPr>
-          <w:rFonts w:cs="Times New Roman" w:ascii="Arial" w:hAnsi="Arial"/>
+        <w:t>Nav</w:t>
+      </w:r>
+      <w:r>
+        <w:rPr>
+          <w:rFonts w:cs="Times New Roman" w:ascii="Arial" w:hAnsi="Arial"/>
+          <w:b w:val="false"/>
+          <w:bCs w:val="false"/>
+          <w:sz w:val="28"/>
+          <w:szCs w:val="28"/>
+        </w:rPr>
+        <w:t xml:space="preserve"> — A navigation bar used to contain the navigational links that will be explained later.</w:t>
+      </w:r>
+    </w:p>
+    <w:p>
+      <w:pPr>
+        <w:pStyle w:val="Normal"/>
+        <w:spacing w:lineRule="auto" w:line="360" w:before="0" w:after="155"/>
+        <w:ind w:left="90" w:right="816"/>
+        <w:jc w:val="both"/>
+        <w:rPr>
+          <w:rFonts w:ascii="Arial" w:hAnsi="Arial" w:cs="Times New Roman"/>
+          <w:b w:val="false"/>
+          <w:bCs w:val="false"/>
+          <w:sz w:val="28"/>
+          <w:szCs w:val="28"/>
+        </w:rPr>
+      </w:pPr>
+      <w:r>
+        <w:rPr>
+          <w:rFonts w:cs="Times New Roman" w:ascii="Arial" w:hAnsi="Arial"/>
+          <w:b w:val="false"/>
+          <w:bCs w:val="false"/>
+          <w:sz w:val="28"/>
+          <w:szCs w:val="28"/>
+        </w:rPr>
+      </w:r>
+    </w:p>
+    <w:p>
+      <w:pPr>
+        <w:pStyle w:val="Normal"/>
+        <w:spacing w:lineRule="auto" w:line="360" w:before="0" w:after="155"/>
+        <w:ind w:left="90" w:right="816"/>
+        <w:jc w:val="both"/>
+        <w:rPr>
+          <w:rFonts w:ascii="Arial" w:hAnsi="Arial" w:cs="Times New Roman"/>
           <w:b/>
           <w:bCs/>
           <w:sz w:val="28"/>
           <w:szCs w:val="28"/>
         </w:rPr>
-        <w:t>Projects</w:t>
-      </w:r>
-      <w:r>
-        <w:rPr>
-          <w:rFonts w:cs="Times New Roman" w:ascii="Arial" w:hAnsi="Arial"/>
-          <w:b w:val="false"/>
-          <w:bCs w:val="false"/>
-          <w:sz w:val="28"/>
-          <w:szCs w:val="28"/>
-        </w:rPr>
-        <w:t xml:space="preserve"> — Features all of my best projects and milestones throughout my journey in programming.</w:t>
-      </w:r>
-    </w:p>
-    <w:p>
-      <w:pPr>
-        <w:pStyle w:val="Normal"/>
-        <w:spacing w:lineRule="auto" w:line="360" w:before="0" w:after="32"/>
-        <w:ind w:left="90" w:right="816"/>
-        <w:jc w:val="both"/>
-        <w:rPr>
-          <w:rFonts w:ascii="Arial" w:hAnsi="Arial" w:cs="Times New Roman"/>
-          <w:b w:val="false"/>
-          <w:bCs w:val="false"/>
-          <w:sz w:val="28"/>
-          <w:szCs w:val="28"/>
-        </w:rPr>
-      </w:pPr>
-      <w:r>
-        <w:rPr>
-          <w:rFonts w:cs="Times New Roman" w:ascii="Arial" w:hAnsi="Arial"/>
-          <w:b w:val="false"/>
-          <w:bCs w:val="false"/>
-          <w:sz w:val="28"/>
-          <w:szCs w:val="28"/>
-        </w:rPr>
-      </w:r>
-    </w:p>
-    <w:p>
-      <w:pPr>
-        <w:pStyle w:val="Normal"/>
-        <w:spacing w:lineRule="auto" w:line="360" w:before="0" w:after="32"/>
-        <w:ind w:left="90" w:right="816"/>
-        <w:jc w:val="both"/>
-        <w:rPr>
-          <w:rFonts w:ascii="Arial" w:hAnsi="Arial" w:cs="Times New Roman"/>
+      </w:pPr>
+      <w:r>
+        <w:rPr>
+          <w:rFonts w:cs="Times New Roman" w:ascii="Arial" w:hAnsi="Arial"/>
           <w:b/>
           <w:bCs/>
           <w:sz w:val="28"/>
           <w:szCs w:val="28"/>
         </w:rPr>
-      </w:pPr>
-      <w:r>
-        <w:rPr>
-          <w:rFonts w:cs="Times New Roman" w:ascii="Arial" w:hAnsi="Arial"/>
+        <w:t>Header</w:t>
+      </w:r>
+      <w:r>
+        <w:rPr>
+          <w:rFonts w:cs="Times New Roman" w:ascii="Arial" w:hAnsi="Arial"/>
+          <w:b w:val="false"/>
+          <w:bCs w:val="false"/>
+          <w:sz w:val="28"/>
+          <w:szCs w:val="28"/>
+        </w:rPr>
+        <w:t xml:space="preserve"> — Used to contain the greeting text and shields.io badges.</w:t>
+      </w:r>
+    </w:p>
+    <w:p>
+      <w:pPr>
+        <w:pStyle w:val="Normal"/>
+        <w:spacing w:lineRule="auto" w:line="360" w:before="0" w:after="155"/>
+        <w:ind w:left="90" w:right="816"/>
+        <w:jc w:val="both"/>
+        <w:rPr>
+          <w:rFonts w:ascii="Arial" w:hAnsi="Arial" w:cs="Times New Roman"/>
           <w:b/>
           <w:bCs/>
           <w:sz w:val="28"/>
           <w:szCs w:val="28"/>
         </w:rPr>
-        <w:t xml:space="preserve">Professions </w:t>
-      </w:r>
-      <w:r>
-        <w:rPr>
-          <w:rFonts w:cs="Times New Roman" w:ascii="Arial" w:hAnsi="Arial"/>
-          <w:b w:val="false"/>
-          <w:bCs w:val="false"/>
-          <w:sz w:val="28"/>
-          <w:szCs w:val="28"/>
-        </w:rPr>
-        <w:t>— Features a short description of my skill set and educational background.</w:t>
-      </w:r>
-    </w:p>
-    <w:p>
-      <w:pPr>
-        <w:pStyle w:val="Normal"/>
-        <w:spacing w:lineRule="auto" w:line="360" w:before="0" w:after="32"/>
-        <w:ind w:left="90" w:right="816"/>
-        <w:jc w:val="both"/>
-        <w:rPr>
-          <w:rFonts w:ascii="Arial" w:hAnsi="Arial" w:cs="Times New Roman"/>
-          <w:b w:val="false"/>
-          <w:bCs w:val="false"/>
-          <w:sz w:val="28"/>
-          <w:szCs w:val="28"/>
-        </w:rPr>
-      </w:pPr>
-      <w:r>
-        <w:rPr>
-          <w:rFonts w:cs="Times New Roman" w:ascii="Arial" w:hAnsi="Arial"/>
-          <w:b w:val="false"/>
-          <w:bCs w:val="false"/>
-          <w:sz w:val="28"/>
-          <w:szCs w:val="28"/>
-        </w:rPr>
-      </w:r>
-    </w:p>
-    <w:p>
-      <w:pPr>
-        <w:pStyle w:val="Normal"/>
-        <w:spacing w:lineRule="auto" w:line="360" w:before="0" w:after="32"/>
-        <w:ind w:left="90" w:right="816"/>
-        <w:jc w:val="both"/>
-        <w:rPr>
-          <w:rFonts w:ascii="Arial" w:hAnsi="Arial" w:cs="Times New Roman"/>
+      </w:pPr>
+      <w:r>
+        <w:rPr>
+          <w:rFonts w:cs="Times New Roman" w:ascii="Arial" w:hAnsi="Arial"/>
           <w:b/>
           <w:bCs/>
           <w:sz w:val="28"/>
           <w:szCs w:val="28"/>
         </w:rPr>
-      </w:pPr>
-      <w:r>
-        <w:rPr>
-          <w:rFonts w:cs="Times New Roman" w:ascii="Arial" w:hAnsi="Arial"/>
+      </w:r>
+    </w:p>
+    <w:p>
+      <w:pPr>
+        <w:pStyle w:val="Normal"/>
+        <w:spacing w:lineRule="auto" w:line="360" w:before="0" w:after="155"/>
+        <w:ind w:left="90" w:right="816"/>
+        <w:jc w:val="both"/>
+        <w:rPr>
+          <w:rFonts w:ascii="Arial" w:hAnsi="Arial" w:cs="Times New Roman"/>
           <w:b/>
           <w:bCs/>
           <w:sz w:val="28"/>
           <w:szCs w:val="28"/>
         </w:rPr>
-        <w:t xml:space="preserve">FlameRender Studios </w:t>
-      </w:r>
-      <w:r>
-        <w:rPr>
-          <w:rFonts w:cs="Times New Roman" w:ascii="Arial" w:hAnsi="Arial"/>
-          <w:b w:val="false"/>
-          <w:bCs w:val="false"/>
-          <w:sz w:val="28"/>
-          <w:szCs w:val="28"/>
-        </w:rPr>
-        <w:t>— Features my 7 year old studio community where I showcase and develop my projects.</w:t>
-      </w:r>
-    </w:p>
-    <w:p>
-      <w:pPr>
-        <w:pStyle w:val="Normal"/>
-        <w:spacing w:lineRule="auto" w:line="360" w:before="0" w:after="32"/>
-        <w:ind w:left="90" w:right="816"/>
-        <w:jc w:val="both"/>
-        <w:rPr>
-          <w:rFonts w:ascii="Arial" w:hAnsi="Arial" w:cs="Times New Roman"/>
-          <w:b w:val="false"/>
-          <w:bCs w:val="false"/>
-          <w:sz w:val="28"/>
-          <w:szCs w:val="28"/>
-        </w:rPr>
-      </w:pPr>
-      <w:r>
-        <w:rPr>
-          <w:rFonts w:cs="Times New Roman" w:ascii="Arial" w:hAnsi="Arial"/>
-          <w:b w:val="false"/>
-          <w:bCs w:val="false"/>
-          <w:sz w:val="28"/>
-          <w:szCs w:val="28"/>
-        </w:rPr>
-      </w:r>
-    </w:p>
-    <w:p>
-      <w:pPr>
-        <w:pStyle w:val="Normal"/>
-        <w:spacing w:lineRule="auto" w:line="360" w:before="0" w:after="32"/>
-        <w:ind w:left="90" w:right="816"/>
-        <w:jc w:val="both"/>
-        <w:rPr>
-          <w:rFonts w:ascii="Arial" w:hAnsi="Arial" w:cs="Times New Roman"/>
+      </w:pPr>
+      <w:r>
+        <w:rPr>
+          <w:rFonts w:cs="Times New Roman" w:ascii="Arial" w:hAnsi="Arial"/>
           <w:b/>
           <w:bCs/>
           <w:sz w:val="28"/>
           <w:szCs w:val="28"/>
         </w:rPr>
+        <w:t>Section</w:t>
+      </w:r>
+      <w:r>
+        <w:rPr>
+          <w:rFonts w:cs="Times New Roman" w:ascii="Arial" w:hAnsi="Arial"/>
+          <w:b w:val="false"/>
+          <w:bCs w:val="false"/>
+          <w:sz w:val="28"/>
+          <w:szCs w:val="28"/>
+        </w:rPr>
+        <w:t xml:space="preserve"> — Used to separate and contain relative content for my projects.</w:t>
+      </w:r>
+    </w:p>
+    <w:p>
+      <w:pPr>
+        <w:pStyle w:val="Normal"/>
+        <w:spacing w:lineRule="auto" w:line="360" w:before="0" w:after="155"/>
+        <w:ind w:left="90" w:right="816"/>
+        <w:jc w:val="both"/>
+        <w:rPr>
+          <w:rFonts w:ascii="Arial" w:hAnsi="Arial" w:cs="Times New Roman"/>
+          <w:b w:val="false"/>
+          <w:bCs w:val="false"/>
+          <w:sz w:val="28"/>
+          <w:szCs w:val="28"/>
+        </w:rPr>
+      </w:pPr>
+      <w:r>
+        <w:rPr>
+          <w:rFonts w:cs="Times New Roman" w:ascii="Arial" w:hAnsi="Arial"/>
+          <w:b w:val="false"/>
+          <w:bCs w:val="false"/>
+          <w:sz w:val="28"/>
+          <w:szCs w:val="28"/>
+        </w:rPr>
+      </w:r>
+    </w:p>
+    <w:p>
+      <w:pPr>
+        <w:pStyle w:val="Normal"/>
+        <w:spacing w:lineRule="auto" w:line="360" w:before="0" w:after="155"/>
+        <w:ind w:left="90" w:right="816"/>
+        <w:jc w:val="both"/>
+        <w:rPr>
+          <w:rFonts w:ascii="Arial" w:hAnsi="Arial" w:cs="Times New Roman"/>
+          <w:b w:val="false"/>
+          <w:bCs w:val="false"/>
+          <w:sz w:val="28"/>
+          <w:szCs w:val="28"/>
+        </w:rPr>
       </w:pPr>
       <w:r>
         <w:rPr>
@@ -1834,17 +1676,264 @@
           <w:sz w:val="28"/>
           <w:szCs w:val="28"/>
         </w:rPr>
-        <w:t xml:space="preserve">Community </w:t>
-      </w:r>
-      <w:r>
-        <w:rPr>
-          <w:rFonts w:cs="Times New Roman" w:ascii="Arial" w:hAnsi="Arial"/>
-          <w:b w:val="false"/>
-          <w:bCs w:val="false"/>
-          <w:sz w:val="28"/>
-          <w:szCs w:val="28"/>
-        </w:rPr>
-        <w:t>— Features my Discord server where FlameRender Studios resides.</w:t>
+        <w:t>Footer</w:t>
+      </w:r>
+      <w:r>
+        <w:rPr>
+          <w:rFonts w:cs="Times New Roman" w:ascii="Arial" w:hAnsi="Arial"/>
+          <w:b w:val="false"/>
+          <w:bCs w:val="false"/>
+          <w:sz w:val="28"/>
+          <w:szCs w:val="28"/>
+        </w:rPr>
+        <w:t xml:space="preserve"> — Used to contain other info such as copyright, social links, and contacts.</w:t>
+      </w:r>
+    </w:p>
+    <w:p>
+      <w:pPr>
+        <w:pStyle w:val="Normal"/>
+        <w:spacing w:lineRule="auto" w:line="360" w:before="0" w:after="155"/>
+        <w:ind w:left="90" w:right="816"/>
+        <w:jc w:val="both"/>
+        <w:rPr>
+          <w:rFonts w:ascii="Arial" w:hAnsi="Arial" w:cs="Times New Roman"/>
+          <w:b w:val="false"/>
+          <w:bCs w:val="false"/>
+          <w:sz w:val="28"/>
+          <w:szCs w:val="28"/>
+        </w:rPr>
+      </w:pPr>
+      <w:r>
+        <w:rPr>
+          <w:rFonts w:cs="Times New Roman" w:ascii="Arial" w:hAnsi="Arial"/>
+          <w:b w:val="false"/>
+          <w:bCs w:val="false"/>
+          <w:sz w:val="28"/>
+          <w:szCs w:val="28"/>
+        </w:rPr>
+      </w:r>
+    </w:p>
+    <w:p>
+      <w:pPr>
+        <w:pStyle w:val="Normal"/>
+        <w:spacing w:lineRule="auto" w:line="360" w:before="0" w:after="155"/>
+        <w:ind w:left="90" w:right="816"/>
+        <w:jc w:val="both"/>
+        <w:rPr>
+          <w:rFonts w:ascii="Arial" w:hAnsi="Arial" w:cs="Times New Roman"/>
+          <w:b w:val="false"/>
+          <w:bCs w:val="false"/>
+          <w:sz w:val="28"/>
+          <w:szCs w:val="28"/>
+        </w:rPr>
+      </w:pPr>
+      <w:r>
+        <w:rPr>
+          <w:rFonts w:cs="Times New Roman" w:ascii="Arial" w:hAnsi="Arial"/>
+          <w:b w:val="false"/>
+          <w:bCs w:val="false"/>
+          <w:sz w:val="28"/>
+          <w:szCs w:val="28"/>
+        </w:rPr>
+        <w:tab/>
+        <w:t>The website uses a glass effect for nav, header, and section to by using a backdrop filter. The purpose of this is to emphasize the moving background of the website and give the website a modern touch.</w:t>
+      </w:r>
+    </w:p>
+    <w:p>
+      <w:pPr>
+        <w:pStyle w:val="Normal"/>
+        <w:spacing w:lineRule="auto" w:line="360" w:before="0" w:after="155"/>
+        <w:ind w:left="90" w:right="816"/>
+        <w:jc w:val="both"/>
+        <w:rPr>
+          <w:rFonts w:ascii="Arial" w:hAnsi="Arial" w:eastAsia="Walbaum Heading" w:cs="Walbaum Heading"/>
+          <w:b w:val="false"/>
+          <w:bCs w:val="false"/>
+          <w:color w:val="1B60C1"/>
+          <w:sz w:val="52"/>
+          <w:szCs w:val="52"/>
+        </w:rPr>
+      </w:pPr>
+      <w:r>
+        <w:rPr>
+          <w:rFonts w:eastAsia="Walbaum Heading" w:cs="Walbaum Heading" w:ascii="Arial" w:hAnsi="Arial"/>
+          <w:b w:val="false"/>
+          <w:bCs w:val="false"/>
+          <w:color w:val="1B60C1"/>
+          <w:sz w:val="52"/>
+          <w:szCs w:val="52"/>
+        </w:rPr>
+      </w:r>
+    </w:p>
+    <w:p>
+      <w:pPr>
+        <w:pStyle w:val="Normal"/>
+        <w:spacing w:lineRule="auto" w:line="360" w:before="0" w:after="0"/>
+        <w:jc w:val="both"/>
+        <w:rPr>
+          <w:color w:val="3465A4"/>
+        </w:rPr>
+      </w:pPr>
+      <w:r>
+        <w:rPr>
+          <w:color w:val="3465A4"/>
+        </w:rPr>
+      </w:r>
+    </w:p>
+    <w:p>
+      <w:pPr>
+        <w:pStyle w:val="Normal"/>
+        <w:spacing w:lineRule="auto" w:line="360" w:before="0" w:after="0"/>
+        <w:jc w:val="both"/>
+        <w:rPr>
+          <w:color w:val="3465A4"/>
+        </w:rPr>
+      </w:pPr>
+      <w:r>
+        <w:rPr>
+          <w:color w:val="3465A4"/>
+        </w:rPr>
+      </w:r>
+    </w:p>
+    <w:p>
+      <w:pPr>
+        <w:pStyle w:val="Normal"/>
+        <w:spacing w:lineRule="auto" w:line="360" w:before="0" w:after="0"/>
+        <w:jc w:val="both"/>
+        <w:rPr>
+          <w:color w:val="3465A4"/>
+        </w:rPr>
+      </w:pPr>
+      <w:r>
+        <w:rPr>
+          <w:color w:val="3465A4"/>
+        </w:rPr>
+      </w:r>
+    </w:p>
+    <w:p>
+      <w:pPr>
+        <w:pStyle w:val="Normal"/>
+        <w:spacing w:lineRule="auto" w:line="360" w:before="0" w:after="0"/>
+        <w:jc w:val="both"/>
+        <w:rPr>
+          <w:color w:val="3465A4"/>
+        </w:rPr>
+      </w:pPr>
+      <w:r>
+        <w:rPr>
+          <w:color w:val="3465A4"/>
+        </w:rPr>
+      </w:r>
+    </w:p>
+    <w:p>
+      <w:pPr>
+        <w:pStyle w:val="Normal"/>
+        <w:spacing w:lineRule="auto" w:line="360" w:before="0" w:after="0"/>
+        <w:jc w:val="both"/>
+        <w:rPr>
+          <w:color w:val="3465A4"/>
+        </w:rPr>
+      </w:pPr>
+      <w:r>
+        <w:rPr>
+          <w:color w:val="3465A4"/>
+        </w:rPr>
+      </w:r>
+    </w:p>
+    <w:p>
+      <w:pPr>
+        <w:pStyle w:val="Normal"/>
+        <w:spacing w:lineRule="auto" w:line="360" w:before="0" w:after="0"/>
+        <w:jc w:val="both"/>
+        <w:rPr>
+          <w:color w:val="3465A4"/>
+        </w:rPr>
+      </w:pPr>
+      <w:r>
+        <w:rPr>
+          <w:color w:val="3465A4"/>
+        </w:rPr>
+      </w:r>
+    </w:p>
+    <w:p>
+      <w:pPr>
+        <w:pStyle w:val="Normal"/>
+        <w:spacing w:lineRule="auto" w:line="360" w:before="0" w:after="0"/>
+        <w:jc w:val="both"/>
+        <w:rPr>
+          <w:color w:val="3465A4"/>
+        </w:rPr>
+      </w:pPr>
+      <w:r>
+        <w:rPr>
+          <w:color w:val="3465A4"/>
+        </w:rPr>
+      </w:r>
+    </w:p>
+    <w:p>
+      <w:pPr>
+        <w:pStyle w:val="Normal"/>
+        <w:spacing w:lineRule="auto" w:line="360" w:before="0" w:after="0"/>
+        <w:jc w:val="both"/>
+        <w:rPr>
+          <w:color w:val="3465A4"/>
+        </w:rPr>
+      </w:pPr>
+      <w:r>
+        <w:rPr>
+          <w:color w:val="3465A4"/>
+        </w:rPr>
+      </w:r>
+    </w:p>
+    <w:p>
+      <w:pPr>
+        <w:pStyle w:val="Normal"/>
+        <w:spacing w:lineRule="auto" w:line="360" w:before="0" w:after="0"/>
+        <w:jc w:val="both"/>
+        <w:rPr>
+          <w:color w:val="3465A4"/>
+        </w:rPr>
+      </w:pPr>
+      <w:r>
+        <w:rPr>
+          <w:color w:val="3465A4"/>
+        </w:rPr>
+      </w:r>
+    </w:p>
+    <w:p>
+      <w:pPr>
+        <w:pStyle w:val="Normal"/>
+        <w:spacing w:lineRule="auto" w:line="360" w:before="0" w:after="0"/>
+        <w:jc w:val="both"/>
+        <w:rPr>
+          <w:color w:val="3465A4"/>
+        </w:rPr>
+      </w:pPr>
+      <w:r>
+        <w:rPr>
+          <w:color w:val="3465A4"/>
+        </w:rPr>
+      </w:r>
+    </w:p>
+    <w:p>
+      <w:pPr>
+        <w:pStyle w:val="Normal"/>
+        <w:spacing w:lineRule="auto" w:line="360" w:before="0" w:after="0"/>
+        <w:jc w:val="both"/>
+        <w:rPr>
+          <w:color w:val="3465A4"/>
+        </w:rPr>
+      </w:pPr>
+      <w:r>
+        <w:rPr>
+          <w:rFonts w:eastAsia="Walbaum Heading" w:cs="Walbaum Heading" w:ascii="Arial" w:hAnsi="Arial"/>
+          <w:b w:val="false"/>
+          <w:bCs w:val="false"/>
+          <w:color w:val="3465A4"/>
+          <w:sz w:val="52"/>
+          <w:szCs w:val="52"/>
+        </w:rPr>
+        <w:t>Interaction Overview</w:t>
       </w:r>
     </w:p>
     <w:p>
@@ -1869,6 +1958,8 @@
           <w:sz w:val="28"/>
           <w:szCs w:val="28"/>
         </w:rPr>
+        <w:tab/>
+        <w:t>The website features a navigation bar and a footer and 7 navigational links to various parts of the page: About Me, Projects, Professions, FlameRender Studios (the clickable logo), Community, Software, and Subscribe. The navigation bar also features button animation hovers to highlight what the user is selecting. The following are the 7 navigational links:</w:t>
       </w:r>
     </w:p>
     <w:p>
@@ -1879,11 +1970,94 @@
         <w:jc w:val="both"/>
         <w:rPr>
           <w:rFonts w:ascii="Arial" w:hAnsi="Arial" w:cs="Times New Roman"/>
+          <w:b w:val="false"/>
+          <w:bCs w:val="false"/>
+          <w:sz w:val="28"/>
+          <w:szCs w:val="28"/>
+        </w:rPr>
+      </w:pPr>
+      <w:r>
+        <w:rPr>
+          <w:rFonts w:cs="Times New Roman" w:ascii="Arial" w:hAnsi="Arial"/>
+          <w:b w:val="false"/>
+          <w:bCs w:val="false"/>
+          <w:sz w:val="28"/>
+          <w:szCs w:val="28"/>
+        </w:rPr>
+      </w:r>
+    </w:p>
+    <w:p>
+      <w:pPr>
+        <w:pStyle w:val="Normal"/>
+        <w:spacing w:lineRule="auto" w:line="360" w:before="0" w:after="32"/>
+        <w:ind w:left="90" w:right="816"/>
+        <w:jc w:val="both"/>
+        <w:rPr>
+          <w:rFonts w:ascii="Arial" w:hAnsi="Arial" w:cs="Times New Roman"/>
+          <w:b w:val="false"/>
+          <w:bCs w:val="false"/>
+          <w:sz w:val="28"/>
+          <w:szCs w:val="28"/>
+        </w:rPr>
+      </w:pPr>
+      <w:r>
+        <w:rPr>
+          <w:rFonts w:cs="Times New Roman" w:ascii="Arial" w:hAnsi="Arial"/>
           <w:b/>
           <w:bCs/>
           <w:sz w:val="28"/>
           <w:szCs w:val="28"/>
         </w:rPr>
+        <w:t>About Me</w:t>
+      </w:r>
+      <w:r>
+        <w:rPr>
+          <w:rFonts w:cs="Times New Roman" w:ascii="Arial" w:hAnsi="Arial"/>
+          <w:b w:val="false"/>
+          <w:bCs w:val="false"/>
+          <w:sz w:val="28"/>
+          <w:szCs w:val="28"/>
+        </w:rPr>
+        <w:t xml:space="preserve"> — Features a short biography about me and my personal background.</w:t>
+      </w:r>
+    </w:p>
+    <w:p>
+      <w:pPr>
+        <w:pStyle w:val="Normal"/>
+        <w:spacing w:lineRule="auto" w:line="360" w:before="0" w:after="32"/>
+        <w:ind w:left="90" w:right="816"/>
+        <w:jc w:val="both"/>
+        <w:rPr>
+          <w:rFonts w:ascii="Arial" w:hAnsi="Arial" w:cs="Times New Roman"/>
+          <w:b w:val="false"/>
+          <w:bCs w:val="false"/>
+          <w:sz w:val="28"/>
+          <w:szCs w:val="28"/>
+        </w:rPr>
+      </w:pPr>
+      <w:r>
+        <w:rPr>
+          <w:rFonts w:cs="Times New Roman" w:ascii="Arial" w:hAnsi="Arial"/>
+          <w:b w:val="false"/>
+          <w:bCs w:val="false"/>
+          <w:sz w:val="28"/>
+          <w:szCs w:val="28"/>
+        </w:rPr>
+      </w:r>
+    </w:p>
+    <w:p>
+      <w:pPr>
+        <w:pStyle w:val="Normal"/>
+        <w:spacing w:lineRule="auto" w:line="360" w:before="0" w:after="32"/>
+        <w:ind w:left="90" w:right="816"/>
+        <w:jc w:val="both"/>
+        <w:rPr>
+          <w:rFonts w:ascii="Arial" w:hAnsi="Arial" w:cs="Times New Roman"/>
+          <w:b w:val="false"/>
+          <w:bCs w:val="false"/>
+          <w:sz w:val="28"/>
+          <w:szCs w:val="28"/>
+        </w:rPr>
       </w:pPr>
       <w:r>
         <w:rPr>
@@ -1893,17 +2067,17 @@
           <w:sz w:val="28"/>
           <w:szCs w:val="28"/>
         </w:rPr>
-        <w:t xml:space="preserve">Software </w:t>
-      </w:r>
-      <w:r>
-        <w:rPr>
-          <w:rFonts w:cs="Times New Roman" w:ascii="Arial" w:hAnsi="Arial"/>
-          <w:b w:val="false"/>
-          <w:bCs w:val="false"/>
-          <w:sz w:val="28"/>
-          <w:szCs w:val="28"/>
-        </w:rPr>
-        <w:t>— Features all of the professional tools I used to develop my projects.</w:t>
+        <w:t>Projects</w:t>
+      </w:r>
+      <w:r>
+        <w:rPr>
+          <w:rFonts w:cs="Times New Roman" w:ascii="Arial" w:hAnsi="Arial"/>
+          <w:b w:val="false"/>
+          <w:bCs w:val="false"/>
+          <w:sz w:val="28"/>
+          <w:szCs w:val="28"/>
+        </w:rPr>
+        <w:t xml:space="preserve"> — Features all of my best projects and milestones throughout my journey in programming.</w:t>
       </w:r>
     </w:p>
     <w:p>
@@ -1952,17 +2126,17 @@
           <w:sz w:val="28"/>
           <w:szCs w:val="28"/>
         </w:rPr>
-        <w:t xml:space="preserve">Subscribe </w:t>
-      </w:r>
-      <w:r>
-        <w:rPr>
-          <w:rFonts w:cs="Times New Roman" w:ascii="Arial" w:hAnsi="Arial"/>
-          <w:b w:val="false"/>
-          <w:bCs w:val="false"/>
-          <w:sz w:val="28"/>
-          <w:szCs w:val="28"/>
-        </w:rPr>
-        <w:t>— Features all the my socials the user can follow or subscribe to be informed of my works.</w:t>
+        <w:t xml:space="preserve">Professions </w:t>
+      </w:r>
+      <w:r>
+        <w:rPr>
+          <w:rFonts w:cs="Times New Roman" w:ascii="Arial" w:hAnsi="Arial"/>
+          <w:b w:val="false"/>
+          <w:bCs w:val="false"/>
+          <w:sz w:val="28"/>
+          <w:szCs w:val="28"/>
+        </w:rPr>
+        <w:t>— Features a short description of my skill set and educational background.</w:t>
       </w:r>
     </w:p>
     <w:p>
@@ -2011,6 +2185,242 @@
           <w:sz w:val="28"/>
           <w:szCs w:val="28"/>
         </w:rPr>
+        <w:t xml:space="preserve">FlameRender Studios </w:t>
+      </w:r>
+      <w:r>
+        <w:rPr>
+          <w:rFonts w:cs="Times New Roman" w:ascii="Arial" w:hAnsi="Arial"/>
+          <w:b w:val="false"/>
+          <w:bCs w:val="false"/>
+          <w:sz w:val="28"/>
+          <w:szCs w:val="28"/>
+        </w:rPr>
+        <w:t>— Features my 7 year old studio community where I showcase and develop my projects.</w:t>
+      </w:r>
+    </w:p>
+    <w:p>
+      <w:pPr>
+        <w:pStyle w:val="Normal"/>
+        <w:spacing w:lineRule="auto" w:line="360" w:before="0" w:after="32"/>
+        <w:ind w:left="90" w:right="816"/>
+        <w:jc w:val="both"/>
+        <w:rPr>
+          <w:rFonts w:ascii="Arial" w:hAnsi="Arial" w:cs="Times New Roman"/>
+          <w:b w:val="false"/>
+          <w:bCs w:val="false"/>
+          <w:sz w:val="28"/>
+          <w:szCs w:val="28"/>
+        </w:rPr>
+      </w:pPr>
+      <w:r>
+        <w:rPr>
+          <w:rFonts w:cs="Times New Roman" w:ascii="Arial" w:hAnsi="Arial"/>
+          <w:b w:val="false"/>
+          <w:bCs w:val="false"/>
+          <w:sz w:val="28"/>
+          <w:szCs w:val="28"/>
+        </w:rPr>
+      </w:r>
+    </w:p>
+    <w:p>
+      <w:pPr>
+        <w:pStyle w:val="Normal"/>
+        <w:spacing w:lineRule="auto" w:line="360" w:before="0" w:after="32"/>
+        <w:ind w:left="90" w:right="816"/>
+        <w:jc w:val="both"/>
+        <w:rPr>
+          <w:rFonts w:ascii="Arial" w:hAnsi="Arial" w:cs="Times New Roman"/>
+          <w:b/>
+          <w:bCs/>
+          <w:sz w:val="28"/>
+          <w:szCs w:val="28"/>
+        </w:rPr>
+      </w:pPr>
+      <w:r>
+        <w:rPr>
+          <w:rFonts w:cs="Times New Roman" w:ascii="Arial" w:hAnsi="Arial"/>
+          <w:b/>
+          <w:bCs/>
+          <w:sz w:val="28"/>
+          <w:szCs w:val="28"/>
+        </w:rPr>
+        <w:t xml:space="preserve">Community </w:t>
+      </w:r>
+      <w:r>
+        <w:rPr>
+          <w:rFonts w:cs="Times New Roman" w:ascii="Arial" w:hAnsi="Arial"/>
+          <w:b w:val="false"/>
+          <w:bCs w:val="false"/>
+          <w:sz w:val="28"/>
+          <w:szCs w:val="28"/>
+        </w:rPr>
+        <w:t>— Features my Discord server where FlameRender Studios resides.</w:t>
+      </w:r>
+    </w:p>
+    <w:p>
+      <w:pPr>
+        <w:pStyle w:val="Normal"/>
+        <w:spacing w:lineRule="auto" w:line="360" w:before="0" w:after="32"/>
+        <w:ind w:left="90" w:right="816"/>
+        <w:jc w:val="both"/>
+        <w:rPr>
+          <w:rFonts w:ascii="Arial" w:hAnsi="Arial" w:cs="Times New Roman"/>
+          <w:b w:val="false"/>
+          <w:bCs w:val="false"/>
+          <w:sz w:val="28"/>
+          <w:szCs w:val="28"/>
+        </w:rPr>
+      </w:pPr>
+      <w:r>
+        <w:rPr>
+          <w:rFonts w:cs="Times New Roman" w:ascii="Arial" w:hAnsi="Arial"/>
+          <w:b w:val="false"/>
+          <w:bCs w:val="false"/>
+          <w:sz w:val="28"/>
+          <w:szCs w:val="28"/>
+        </w:rPr>
+      </w:r>
+    </w:p>
+    <w:p>
+      <w:pPr>
+        <w:pStyle w:val="Normal"/>
+        <w:spacing w:lineRule="auto" w:line="360" w:before="0" w:after="32"/>
+        <w:ind w:left="90" w:right="816"/>
+        <w:jc w:val="both"/>
+        <w:rPr>
+          <w:rFonts w:ascii="Arial" w:hAnsi="Arial" w:cs="Times New Roman"/>
+          <w:b/>
+          <w:bCs/>
+          <w:sz w:val="28"/>
+          <w:szCs w:val="28"/>
+        </w:rPr>
+      </w:pPr>
+      <w:r>
+        <w:rPr>
+          <w:rFonts w:cs="Times New Roman" w:ascii="Arial" w:hAnsi="Arial"/>
+          <w:b/>
+          <w:bCs/>
+          <w:sz w:val="28"/>
+          <w:szCs w:val="28"/>
+        </w:rPr>
+        <w:t xml:space="preserve">Software </w:t>
+      </w:r>
+      <w:r>
+        <w:rPr>
+          <w:rFonts w:cs="Times New Roman" w:ascii="Arial" w:hAnsi="Arial"/>
+          <w:b w:val="false"/>
+          <w:bCs w:val="false"/>
+          <w:sz w:val="28"/>
+          <w:szCs w:val="28"/>
+        </w:rPr>
+        <w:t>— Features all of the professional tools I used to develop my projects.</w:t>
+      </w:r>
+    </w:p>
+    <w:p>
+      <w:pPr>
+        <w:pStyle w:val="Normal"/>
+        <w:spacing w:lineRule="auto" w:line="360" w:before="0" w:after="32"/>
+        <w:ind w:left="90" w:right="816"/>
+        <w:jc w:val="both"/>
+        <w:rPr>
+          <w:rFonts w:ascii="Arial" w:hAnsi="Arial" w:cs="Times New Roman"/>
+          <w:b w:val="false"/>
+          <w:bCs w:val="false"/>
+          <w:sz w:val="28"/>
+          <w:szCs w:val="28"/>
+        </w:rPr>
+      </w:pPr>
+      <w:r>
+        <w:rPr>
+          <w:rFonts w:cs="Times New Roman" w:ascii="Arial" w:hAnsi="Arial"/>
+          <w:b w:val="false"/>
+          <w:bCs w:val="false"/>
+          <w:sz w:val="28"/>
+          <w:szCs w:val="28"/>
+        </w:rPr>
+      </w:r>
+    </w:p>
+    <w:p>
+      <w:pPr>
+        <w:pStyle w:val="Normal"/>
+        <w:spacing w:lineRule="auto" w:line="360" w:before="0" w:after="32"/>
+        <w:ind w:left="90" w:right="816"/>
+        <w:jc w:val="both"/>
+        <w:rPr>
+          <w:rFonts w:ascii="Arial" w:hAnsi="Arial" w:cs="Times New Roman"/>
+          <w:b/>
+          <w:bCs/>
+          <w:sz w:val="28"/>
+          <w:szCs w:val="28"/>
+        </w:rPr>
+      </w:pPr>
+      <w:r>
+        <w:rPr>
+          <w:rFonts w:cs="Times New Roman" w:ascii="Arial" w:hAnsi="Arial"/>
+          <w:b/>
+          <w:bCs/>
+          <w:sz w:val="28"/>
+          <w:szCs w:val="28"/>
+        </w:rPr>
+        <w:t xml:space="preserve">Subscribe </w:t>
+      </w:r>
+      <w:r>
+        <w:rPr>
+          <w:rFonts w:cs="Times New Roman" w:ascii="Arial" w:hAnsi="Arial"/>
+          <w:b w:val="false"/>
+          <w:bCs w:val="false"/>
+          <w:sz w:val="28"/>
+          <w:szCs w:val="28"/>
+        </w:rPr>
+        <w:t>— Features all the my socials the user can follow or subscribe to be informed of my works.</w:t>
+      </w:r>
+    </w:p>
+    <w:p>
+      <w:pPr>
+        <w:pStyle w:val="Normal"/>
+        <w:spacing w:lineRule="auto" w:line="360" w:before="0" w:after="32"/>
+        <w:ind w:left="90" w:right="816"/>
+        <w:jc w:val="both"/>
+        <w:rPr>
+          <w:rFonts w:ascii="Arial" w:hAnsi="Arial" w:cs="Times New Roman"/>
+          <w:b w:val="false"/>
+          <w:bCs w:val="false"/>
+          <w:sz w:val="28"/>
+          <w:szCs w:val="28"/>
+        </w:rPr>
+      </w:pPr>
+      <w:r>
+        <w:rPr>
+          <w:rFonts w:cs="Times New Roman" w:ascii="Arial" w:hAnsi="Arial"/>
+          <w:b w:val="false"/>
+          <w:bCs w:val="false"/>
+          <w:sz w:val="28"/>
+          <w:szCs w:val="28"/>
+        </w:rPr>
+      </w:r>
+    </w:p>
+    <w:p>
+      <w:pPr>
+        <w:pStyle w:val="Normal"/>
+        <w:spacing w:lineRule="auto" w:line="360" w:before="0" w:after="32"/>
+        <w:ind w:left="90" w:right="816"/>
+        <w:jc w:val="both"/>
+        <w:rPr>
+          <w:rFonts w:ascii="Arial" w:hAnsi="Arial" w:cs="Times New Roman"/>
+          <w:b/>
+          <w:bCs/>
+          <w:sz w:val="28"/>
+          <w:szCs w:val="28"/>
+        </w:rPr>
+      </w:pPr>
+      <w:r>
+        <w:rPr>
+          <w:rFonts w:cs="Times New Roman" w:ascii="Arial" w:hAnsi="Arial"/>
+          <w:b/>
+          <w:bCs/>
+          <w:sz w:val="28"/>
+          <w:szCs w:val="28"/>
+        </w:rPr>
         <w:t xml:space="preserve">Footer </w:t>
       </w:r>
       <w:r>
@@ -2044,6 +2454,236 @@
           <w:b w:val="false"/>
           <w:bCs w:val="false"/>
           <w:color w:val="3465A4"/>
+          <w:sz w:val="52"/>
+          <w:szCs w:val="52"/>
+        </w:rPr>
+      </w:r>
+    </w:p>
+    <w:p>
+      <w:pPr>
+        <w:pStyle w:val="Normal"/>
+        <w:spacing w:lineRule="auto" w:line="360" w:before="0" w:after="0"/>
+        <w:jc w:val="both"/>
+        <w:rPr>
+          <w:rFonts w:ascii="Arial" w:hAnsi="Arial" w:cs="Walbaum Heading"/>
+          <w:b w:val="false"/>
+          <w:bCs w:val="false"/>
+          <w:sz w:val="52"/>
+          <w:szCs w:val="52"/>
+        </w:rPr>
+      </w:pPr>
+      <w:r>
+        <w:rPr>
+          <w:rFonts w:cs="Walbaum Heading" w:ascii="Arial" w:hAnsi="Arial"/>
+          <w:b w:val="false"/>
+          <w:bCs w:val="false"/>
+          <w:sz w:val="52"/>
+          <w:szCs w:val="52"/>
+        </w:rPr>
+      </w:r>
+    </w:p>
+    <w:p>
+      <w:pPr>
+        <w:pStyle w:val="Normal"/>
+        <w:spacing w:lineRule="auto" w:line="360" w:before="0" w:after="0"/>
+        <w:jc w:val="both"/>
+        <w:rPr>
+          <w:rFonts w:ascii="Arial" w:hAnsi="Arial" w:cs="Walbaum Heading"/>
+          <w:b w:val="false"/>
+          <w:bCs w:val="false"/>
+          <w:sz w:val="52"/>
+          <w:szCs w:val="52"/>
+        </w:rPr>
+      </w:pPr>
+      <w:r>
+        <w:rPr>
+          <w:rFonts w:cs="Walbaum Heading" w:ascii="Arial" w:hAnsi="Arial"/>
+          <w:b w:val="false"/>
+          <w:bCs w:val="false"/>
+          <w:sz w:val="52"/>
+          <w:szCs w:val="52"/>
+        </w:rPr>
+      </w:r>
+    </w:p>
+    <w:p>
+      <w:pPr>
+        <w:pStyle w:val="Normal"/>
+        <w:spacing w:lineRule="auto" w:line="360" w:before="0" w:after="0"/>
+        <w:jc w:val="both"/>
+        <w:rPr>
+          <w:rFonts w:ascii="Arial" w:hAnsi="Arial" w:cs="Walbaum Heading"/>
+          <w:b w:val="false"/>
+          <w:bCs w:val="false"/>
+          <w:sz w:val="52"/>
+          <w:szCs w:val="52"/>
+        </w:rPr>
+      </w:pPr>
+      <w:r>
+        <w:rPr>
+          <w:rFonts w:cs="Walbaum Heading" w:ascii="Arial" w:hAnsi="Arial"/>
+          <w:b w:val="false"/>
+          <w:bCs w:val="false"/>
+          <w:sz w:val="52"/>
+          <w:szCs w:val="52"/>
+        </w:rPr>
+      </w:r>
+    </w:p>
+    <w:p>
+      <w:pPr>
+        <w:pStyle w:val="Normal"/>
+        <w:spacing w:lineRule="auto" w:line="360" w:before="0" w:after="0"/>
+        <w:jc w:val="both"/>
+        <w:rPr>
+          <w:rFonts w:ascii="Arial" w:hAnsi="Arial" w:cs="Walbaum Heading"/>
+          <w:b w:val="false"/>
+          <w:bCs w:val="false"/>
+          <w:sz w:val="52"/>
+          <w:szCs w:val="52"/>
+        </w:rPr>
+      </w:pPr>
+      <w:r>
+        <w:rPr>
+          <w:rFonts w:cs="Walbaum Heading" w:ascii="Arial" w:hAnsi="Arial"/>
+          <w:b w:val="false"/>
+          <w:bCs w:val="false"/>
+          <w:sz w:val="52"/>
+          <w:szCs w:val="52"/>
+        </w:rPr>
+      </w:r>
+    </w:p>
+    <w:p>
+      <w:pPr>
+        <w:pStyle w:val="Normal"/>
+        <w:spacing w:lineRule="auto" w:line="360" w:before="0" w:after="0"/>
+        <w:jc w:val="both"/>
+        <w:rPr>
+          <w:rFonts w:ascii="Arial" w:hAnsi="Arial" w:cs="Walbaum Heading"/>
+          <w:b w:val="false"/>
+          <w:bCs w:val="false"/>
+          <w:sz w:val="52"/>
+          <w:szCs w:val="52"/>
+        </w:rPr>
+      </w:pPr>
+      <w:r>
+        <w:rPr>
+          <w:rFonts w:cs="Walbaum Heading" w:ascii="Arial" w:hAnsi="Arial"/>
+          <w:b w:val="false"/>
+          <w:bCs w:val="false"/>
+          <w:sz w:val="52"/>
+          <w:szCs w:val="52"/>
+        </w:rPr>
+      </w:r>
+    </w:p>
+    <w:p>
+      <w:pPr>
+        <w:pStyle w:val="Normal"/>
+        <w:spacing w:lineRule="auto" w:line="360" w:before="0" w:after="0"/>
+        <w:jc w:val="both"/>
+        <w:rPr>
+          <w:rFonts w:ascii="Arial" w:hAnsi="Arial" w:cs="Walbaum Heading"/>
+          <w:b w:val="false"/>
+          <w:bCs w:val="false"/>
+          <w:sz w:val="52"/>
+          <w:szCs w:val="52"/>
+        </w:rPr>
+      </w:pPr>
+      <w:r>
+        <w:rPr>
+          <w:rFonts w:cs="Walbaum Heading" w:ascii="Arial" w:hAnsi="Arial"/>
+          <w:b w:val="false"/>
+          <w:bCs w:val="false"/>
+          <w:sz w:val="52"/>
+          <w:szCs w:val="52"/>
+        </w:rPr>
+      </w:r>
+    </w:p>
+    <w:p>
+      <w:pPr>
+        <w:pStyle w:val="Normal"/>
+        <w:spacing w:lineRule="auto" w:line="360" w:before="0" w:after="0"/>
+        <w:jc w:val="both"/>
+        <w:rPr>
+          <w:rFonts w:ascii="Arial" w:hAnsi="Arial" w:cs="Walbaum Heading"/>
+          <w:b w:val="false"/>
+          <w:bCs w:val="false"/>
+          <w:sz w:val="52"/>
+          <w:szCs w:val="52"/>
+        </w:rPr>
+      </w:pPr>
+      <w:r>
+        <w:rPr>
+          <w:rFonts w:cs="Walbaum Heading" w:ascii="Arial" w:hAnsi="Arial"/>
+          <w:b w:val="false"/>
+          <w:bCs w:val="false"/>
+          <w:sz w:val="52"/>
+          <w:szCs w:val="52"/>
+        </w:rPr>
+      </w:r>
+    </w:p>
+    <w:p>
+      <w:pPr>
+        <w:pStyle w:val="Normal"/>
+        <w:spacing w:lineRule="auto" w:line="360" w:before="0" w:after="0"/>
+        <w:jc w:val="both"/>
+        <w:rPr>
+          <w:rFonts w:ascii="Arial" w:hAnsi="Arial" w:cs="Walbaum Heading"/>
+          <w:b w:val="false"/>
+          <w:bCs w:val="false"/>
+          <w:sz w:val="52"/>
+          <w:szCs w:val="52"/>
+        </w:rPr>
+      </w:pPr>
+      <w:r>
+        <w:rPr>
+          <w:rFonts w:cs="Walbaum Heading" w:ascii="Arial" w:hAnsi="Arial"/>
+          <w:b w:val="false"/>
+          <w:bCs w:val="false"/>
+          <w:sz w:val="52"/>
+          <w:szCs w:val="52"/>
+        </w:rPr>
+      </w:r>
+    </w:p>
+    <w:p>
+      <w:pPr>
+        <w:pStyle w:val="Normal"/>
+        <w:spacing w:lineRule="auto" w:line="360" w:before="0" w:after="0"/>
+        <w:jc w:val="both"/>
+        <w:rPr>
+          <w:rFonts w:ascii="Arial" w:hAnsi="Arial" w:cs="Walbaum Heading"/>
+          <w:b w:val="false"/>
+          <w:bCs w:val="false"/>
+          <w:sz w:val="52"/>
+          <w:szCs w:val="52"/>
+        </w:rPr>
+      </w:pPr>
+      <w:r>
+        <w:rPr>
+          <w:rFonts w:cs="Walbaum Heading" w:ascii="Arial" w:hAnsi="Arial"/>
+          <w:b w:val="false"/>
+          <w:bCs w:val="false"/>
+          <w:sz w:val="52"/>
+          <w:szCs w:val="52"/>
+        </w:rPr>
+      </w:r>
+    </w:p>
+    <w:p>
+      <w:pPr>
+        <w:pStyle w:val="Normal"/>
+        <w:spacing w:lineRule="auto" w:line="360" w:before="0" w:after="0"/>
+        <w:jc w:val="both"/>
+        <w:rPr>
+          <w:rFonts w:ascii="Arial" w:hAnsi="Arial" w:cs="Walbaum Heading"/>
+          <w:b w:val="false"/>
+          <w:bCs w:val="false"/>
+          <w:sz w:val="52"/>
+          <w:szCs w:val="52"/>
+        </w:rPr>
+      </w:pPr>
+      <w:r>
+        <w:rPr>
+          <w:rFonts w:cs="Walbaum Heading" w:ascii="Arial" w:hAnsi="Arial"/>
+          <w:b w:val="false"/>
+          <w:bCs w:val="false"/>
           <w:sz w:val="52"/>
           <w:szCs w:val="52"/>
         </w:rPr>
@@ -2608,7 +3248,7 @@
           <w:szCs w:val="28"/>
         </w:rPr>
         <w:tab/>
-        <w:t>While I exercise great flexibility with designing websites with Figma, I realized that it is extremely different on the developer side. For the developer, they face more challenges while also gaining more flexibility  and options compared to designing a website in Figma where it is mostly static.</w:t>
+        <w:t>While I exercise great flexibility with designing websites with Figma, I realized that it is extremely different on the developer side. For the developer. They face more challenges while also gaining more flexibility  and options compared to designing a website in Figma where it is mostly static and limited.</w:t>
       </w:r>
     </w:p>
     <w:p>
@@ -2658,7 +3298,7 @@
           <w:szCs w:val="28"/>
         </w:rPr>
         <w:tab/>
-        <w:t>I learned that a good website is not complete without a back end. I faced the challenges of making a responsive website, browser compatibility, learned essential optimization skills for JavaScript and p5.js, and discovered how to use the debugging tools of my browser which helped dissect parts of my website.</w:t>
+        <w:t>I learned that a good website is not complete without a back end for it to function. While it is optional, it is needed to record user filled forms to to establish communication with the commissioner since it is a portfolio website.</w:t>
       </w:r>
     </w:p>
     <w:p>
@@ -2683,6 +3323,7 @@
           <w:sz w:val="28"/>
           <w:szCs w:val="28"/>
         </w:rPr>
+        <w:tab/>
       </w:r>
     </w:p>
     <w:p>
@@ -2708,59 +3349,57 @@
           <w:szCs w:val="28"/>
         </w:rPr>
         <w:tab/>
+        <w:t>I faced the challenges of making a responsive website, browser compatibility, learned essential optimization skills for JavaScript and p5.js, and discovered how to use the debugging tools of my browser which helped dissect parts of my website.</w:t>
+      </w:r>
+    </w:p>
+    <w:p>
+      <w:pPr>
+        <w:pStyle w:val="Normal"/>
+        <w:spacing w:lineRule="auto" w:line="360" w:before="0" w:after="32"/>
+        <w:ind w:right="816"/>
+        <w:jc w:val="both"/>
+        <w:rPr>
+          <w:rFonts w:ascii="Arial" w:hAnsi="Arial" w:cs="Times New Roman"/>
+          <w:b w:val="false"/>
+          <w:bCs w:val="false"/>
+          <w:sz w:val="28"/>
+          <w:szCs w:val="28"/>
+        </w:rPr>
+      </w:pPr>
+      <w:r>
+        <w:rPr>
+          <w:rFonts w:cs="Times New Roman" w:ascii="Arial" w:hAnsi="Arial"/>
+          <w:b w:val="false"/>
+          <w:bCs w:val="false"/>
+          <w:sz w:val="28"/>
+          <w:szCs w:val="28"/>
+        </w:rPr>
+      </w:r>
+    </w:p>
+    <w:p>
+      <w:pPr>
+        <w:pStyle w:val="Normal"/>
+        <w:spacing w:lineRule="auto" w:line="360" w:before="0" w:after="32"/>
+        <w:ind w:right="816"/>
+        <w:jc w:val="both"/>
+        <w:rPr>
+          <w:rFonts w:ascii="Arial" w:hAnsi="Arial" w:cs="Times New Roman"/>
+          <w:b w:val="false"/>
+          <w:bCs w:val="false"/>
+          <w:sz w:val="28"/>
+          <w:szCs w:val="28"/>
+        </w:rPr>
+      </w:pPr>
+      <w:r>
+        <w:rPr>
+          <w:rFonts w:cs="Times New Roman" w:ascii="Arial" w:hAnsi="Arial"/>
+          <w:b w:val="false"/>
+          <w:bCs w:val="false"/>
+          <w:sz w:val="28"/>
+          <w:szCs w:val="28"/>
+        </w:rPr>
+        <w:tab/>
         <w:t>I intend to continue updating this website to show more of my skills and showcase more of my works as I grow as a shader developer, web developer, and creative coder.</w:t>
-      </w:r>
-    </w:p>
-    <w:p>
-      <w:pPr>
-        <w:pStyle w:val="Normal"/>
-        <w:spacing w:lineRule="auto" w:line="360" w:before="0" w:after="143"/>
-        <w:ind w:right="816"/>
-        <w:jc w:val="both"/>
-        <w:rPr>
-          <w:rFonts w:ascii="Arial" w:hAnsi="Arial" w:cs="Times New Roman"/>
-          <w:b w:val="false"/>
-          <w:bCs w:val="false"/>
-          <w:color w:val="3465A4"/>
-          <w:sz w:val="52"/>
-          <w:szCs w:val="28"/>
-        </w:rPr>
-      </w:pPr>
-      <w:r>
-        <w:rPr>
-          <w:rFonts w:cs="Times New Roman" w:ascii="Arial" w:hAnsi="Arial"/>
-          <w:b w:val="false"/>
-          <w:bCs w:val="false"/>
-          <w:color w:val="3465A4"/>
-          <w:sz w:val="52"/>
-          <w:szCs w:val="28"/>
-        </w:rPr>
-      </w:r>
-    </w:p>
-    <w:p>
-      <w:pPr>
-        <w:pStyle w:val="Normal"/>
-        <w:spacing w:lineRule="auto" w:line="360" w:before="0" w:after="143"/>
-        <w:ind w:right="816"/>
-        <w:jc w:val="both"/>
-        <w:rPr>
-          <w:rFonts w:ascii="Arial" w:hAnsi="Arial" w:cs="Times New Roman"/>
-          <w:b w:val="false"/>
-          <w:bCs w:val="false"/>
-          <w:color w:val="3465A4"/>
-          <w:sz w:val="52"/>
-          <w:szCs w:val="28"/>
-        </w:rPr>
-      </w:pPr>
-      <w:r>
-        <w:rPr>
-          <w:rFonts w:cs="Times New Roman" w:ascii="Arial" w:hAnsi="Arial"/>
-          <w:b w:val="false"/>
-          <w:bCs w:val="false"/>
-          <w:color w:val="3465A4"/>
-          <w:sz w:val="52"/>
-          <w:szCs w:val="28"/>
-        </w:rPr>
       </w:r>
     </w:p>
     <w:p>

</xml_diff>